<commit_message>
Atualiza referencias de commit apos a migracao do repositorio
O historico foi reescrito para retirar as linhas de coautoria automatica
das mensagens; o conteudo de cada commit nao mudou. Os documentos passam
a citar os hashes novos (13e58b9 -> 8e6ce9d, 6231961 -> cb92d7b,
0a3f88b -> 995a942), os relatorios .docx foram regenerados e
docs/MAPA-COMMITS.md registra a correspondencia completa.
</commit_message>
<xml_diff>
--- a/docs/reports/Relatorio-Cobertura-Codigo-JaCoCo.docx
+++ b/docs/reports/Relatorio-Cobertura-Codigo-JaCoCo.docx
@@ -277,7 +277,7 @@
                 <w:sz w:val="19"/>
                 <w:szCs w:val="19"/>
               </w:rPr>
-              <w:t xml:space="preserve">13e58b9</w:t>
+              <w:t xml:space="preserve">8e6ce9d</w:t>
             </w:r>
           </w:p>
         </w:tc>
@@ -5273,7 +5273,7 @@
                 <w:sz w:val="19"/>
                 <w:szCs w:val="19"/>
               </w:rPr>
-              <w:t xml:space="preserve">6231961</w:t>
+              <w:t xml:space="preserve">cb92d7b</w:t>
             </w:r>
           </w:p>
         </w:tc>
@@ -5684,7 +5684,7 @@
                 <w:sz w:val="19"/>
                 <w:szCs w:val="19"/>
               </w:rPr>
-              <w:t xml:space="preserve">13e58b9</w:t>
+              <w:t xml:space="preserve">8e6ce9d</w:t>
             </w:r>
           </w:p>
         </w:tc>
@@ -5890,7 +5890,7 @@
                 <w:sz w:val="19"/>
                 <w:szCs w:val="19"/>
               </w:rPr>
-              <w:t xml:space="preserve">13e58b9</w:t>
+              <w:t xml:space="preserve">8e6ce9d</w:t>
             </w:r>
           </w:p>
         </w:tc>

</xml_diff>